<commit_message>
ligne bouton succes effacer
</commit_message>
<xml_diff>
--- a/Cahier+de+recette+du+site+724events+à+compléter (2) (Réparé).docx
+++ b/Cahier+de+recette+du+site+724events+à+compléter (2) (Réparé).docx
@@ -1691,7 +1691,16 @@
                 <w:szCs w:val="20"/>
                 <w:lang w:val="fr-FR"/>
               </w:rPr>
-              <w:t xml:space="preserve">Lorsque le </w:t>
+              <w:t xml:space="preserve">En consultant </w:t>
+            </w:r>
+            <w:r>
+              <w:rPr>
+                <w:rFonts w:ascii="Montserrat" w:eastAsia="Montserrat" w:hAnsi="Montserrat" w:cs="Montserrat"/>
+                <w:sz w:val="20"/>
+                <w:szCs w:val="20"/>
+                <w:lang w:val="fr-FR"/>
+              </w:rPr>
+              <w:t xml:space="preserve">le </w:t>
             </w:r>
             <w:proofErr w:type="spellStart"/>
             <w:r>
@@ -1711,7 +1720,7 @@
                 <w:szCs w:val="20"/>
                 <w:lang w:val="fr-FR"/>
               </w:rPr>
-              <w:t xml:space="preserve"> est créé</w:t>
+              <w:t xml:space="preserve"> </w:t>
             </w:r>
           </w:p>
         </w:tc>

</xml_diff>